<commit_message>
docs: report v4 - appendix B repo link only (commit records removed)
</commit_message>
<xml_diff>
--- a/docs/斗地组_实验报告.docx
+++ b/docs/斗地组_实验报告.docx
@@ -146,7 +146,7 @@
           <w:color w:val="2E3238"/>
           <w:sz w:val="22"/>
         </w:rPr>
-        <w:t>本项目实现了一款运行于终端（命令行）的纯文字版地牢冒险游戏（MUD，Multi-User Dungeon）。玩家扮演勇者，通过输入中文命令在五层地牢中探索移动、回合制战斗、拾取物品、商店交易、与 NPC 对话，最终击败魔王通关。游戏支持双结局（勇者结局 / 新魔王结局）、攻击向导玩法、逐层 NPC 剧情、装备数值拆分显示与存档读档，全部命令支持中英双语别名（如 go/attack/open/drop/save）。项目采用 C++17 标准，仅依赖 C++ 标准库，代码共约 2869 行，划分为 text / core / character / combat / map / item 六个模块，具备跨平台（Windows / Linux / macOS）编译能力，并对华为鲲鹏等异构平台给出了适配思路。项目全程使用 Git 做版本管理并托管于 GitHub（BugMaker-orz/Code-class-MUD-game，共 15 个提交，详见附录 B）。</w:t>
+        <w:t>本项目实现了一款运行于终端（命令行）的纯文字版地牢冒险游戏（MUD，Multi-User Dungeon）。玩家扮演勇者，通过输入中文命令在五层地牢中探索移动、回合制战斗、拾取物品、商店交易、与 NPC 对话，最终击败魔王通关。游戏支持双结局（勇者结局 / 新魔王结局）、攻击向导玩法、逐层 NPC 剧情、装备数值拆分显示与存档读档，全部命令支持中英双语别名（如 go/attack/open/drop/save）。项目采用 C++17 标准，仅依赖 C++ 标准库，代码共约 2869 行，划分为 text / core / character / combat / map / item 六个模块，具备跨平台（Windows / Linux / macOS）编译能力，并对华为鲲鹏等异构平台给出了适配思路。项目全程使用 Git 做版本管理并托管于 GitHub（BugMaker-orz/Code-class-MUD-game，仓库地址见附录 B）。</w:t>
       </w:r>
     </w:p>
     <w:p>
@@ -7209,943 +7209,8 @@
           <w:rFonts w:ascii="Times New Roman" w:hAnsi="Times New Roman" w:eastAsia="宋体"/>
           <w:sz w:val="22"/>
         </w:rPr>
-        <w:t>仓库地址：https://github.com/BugMaker-orz/Code-class-MUD-game（main 分支，共 15 个提交）</w:t>
+        <w:t>https://github.com/BugMaker-orz/Code-class-MUD-game（main 分支）</w:t>
       </w:r>
-    </w:p>
-    <w:p>
-      <w:pPr>
-        <w:ind w:firstLine="420"/>
-      </w:pPr>
-      <w:r>
-        <w:rPr>
-          <w:rFonts w:ascii="Times New Roman" w:hAnsi="Times New Roman" w:eastAsia="宋体"/>
-          <w:b w:val="0"/>
-          <w:color w:val="2E3238"/>
-          <w:sz w:val="22"/>
-        </w:rPr>
-        <w:t>GitHub 仓库完整提交记录共 15 条（按时间顺序，最新在上方；内容为项目大体完成后逐步完善的迭代记录）：</w:t>
-      </w:r>
-    </w:p>
-    <w:tbl>
-      <w:tblPr>
-        <w:tblStyle w:val="TableGrid"/>
-        <w:tblW w:type="auto" w:w="0"/>
-        <w:jc w:val="center"/>
-        <w:tblLayout w:type="fixed"/>
-        <w:tblLook w:firstColumn="1" w:firstRow="1" w:lastColumn="0" w:lastRow="0" w:noHBand="0" w:noVBand="1" w:val="04A0"/>
-      </w:tblPr>
-      <w:tblGrid>
-        <w:gridCol w:w="567"/>
-        <w:gridCol w:w="1361"/>
-        <w:gridCol w:w="7030"/>
-      </w:tblGrid>
-      <w:tr>
-        <w:tc>
-          <w:tcPr>
-            <w:tcW w:type="dxa" w:w="567"/>
-            <w:shd w:val="clear" w:fill="D4E5F7"/>
-          </w:tcPr>
-          <w:p>
-            <w:pPr>
-              <w:jc w:val="center"/>
-            </w:pPr>
-            <w:r/>
-            <w:r>
-              <w:rPr>
-                <w:rFonts w:ascii="Times New Roman" w:hAnsi="Times New Roman" w:eastAsia="宋体"/>
-                <w:b/>
-                <w:sz w:val="19"/>
-              </w:rPr>
-              <w:t>#</w:t>
-            </w:r>
-          </w:p>
-        </w:tc>
-        <w:tc>
-          <w:tcPr>
-            <w:tcW w:type="dxa" w:w="1361"/>
-            <w:shd w:val="clear" w:fill="D4E5F7"/>
-          </w:tcPr>
-          <w:p>
-            <w:pPr>
-              <w:jc w:val="center"/>
-            </w:pPr>
-            <w:r/>
-            <w:r>
-              <w:rPr>
-                <w:rFonts w:ascii="Times New Roman" w:hAnsi="Times New Roman" w:eastAsia="宋体"/>
-                <w:b/>
-                <w:sz w:val="19"/>
-              </w:rPr>
-              <w:t>提交号</w:t>
-            </w:r>
-          </w:p>
-        </w:tc>
-        <w:tc>
-          <w:tcPr>
-            <w:tcW w:type="dxa" w:w="7030"/>
-            <w:shd w:val="clear" w:fill="D4E5F7"/>
-          </w:tcPr>
-          <w:p>
-            <w:pPr>
-              <w:jc w:val="center"/>
-            </w:pPr>
-            <w:r/>
-            <w:r>
-              <w:rPr>
-                <w:rFonts w:ascii="Times New Roman" w:hAnsi="Times New Roman" w:eastAsia="宋体"/>
-                <w:b/>
-                <w:sz w:val="19"/>
-              </w:rPr>
-              <w:t>提交说明</w:t>
-            </w:r>
-          </w:p>
-        </w:tc>
-      </w:tr>
-      <w:tr>
-        <w:tc>
-          <w:tcPr>
-            <w:tcW w:type="dxa" w:w="567"/>
-          </w:tcPr>
-          <w:p>
-            <w:pPr>
-              <w:jc w:val="center"/>
-            </w:pPr>
-            <w:r/>
-            <w:r>
-              <w:rPr>
-                <w:rFonts w:ascii="Times New Roman" w:hAnsi="Times New Roman" w:eastAsia="宋体"/>
-                <w:sz w:val="18"/>
-              </w:rPr>
-              <w:t>15</w:t>
-            </w:r>
-          </w:p>
-        </w:tc>
-        <w:tc>
-          <w:tcPr>
-            <w:tcW w:type="dxa" w:w="1361"/>
-          </w:tcPr>
-          <w:p>
-            <w:pPr>
-              <w:jc w:val="center"/>
-            </w:pPr>
-            <w:r/>
-            <w:r>
-              <w:rPr>
-                <w:rFonts w:ascii="Times New Roman" w:hAnsi="Times New Roman" w:eastAsia="宋体"/>
-                <w:sz w:val="18"/>
-              </w:rPr>
-              <w:t>2a3a892</w:t>
-            </w:r>
-          </w:p>
-        </w:tc>
-        <w:tc>
-          <w:tcPr>
-            <w:tcW w:type="dxa" w:w="7030"/>
-          </w:tcPr>
-          <w:p>
-            <w:pPr>
-              <w:jc w:val="left"/>
-            </w:pPr>
-            <w:r/>
-            <w:r>
-              <w:rPr>
-                <w:rFonts w:ascii="Times New Roman" w:hAnsi="Times New Roman" w:eastAsia="宋体"/>
-                <w:sz w:val="18"/>
-              </w:rPr>
-              <w:t>v2.4：背包满不丢物品、新增丢弃命令、宝箱内容隐藏</w:t>
-            </w:r>
-          </w:p>
-        </w:tc>
-      </w:tr>
-      <w:tr>
-        <w:tc>
-          <w:tcPr>
-            <w:tcW w:type="dxa" w:w="567"/>
-          </w:tcPr>
-          <w:p>
-            <w:pPr>
-              <w:jc w:val="center"/>
-            </w:pPr>
-            <w:r/>
-            <w:r>
-              <w:rPr>
-                <w:rFonts w:ascii="Times New Roman" w:hAnsi="Times New Roman" w:eastAsia="宋体"/>
-                <w:sz w:val="18"/>
-              </w:rPr>
-              <w:t>14</w:t>
-            </w:r>
-          </w:p>
-        </w:tc>
-        <w:tc>
-          <w:tcPr>
-            <w:tcW w:type="dxa" w:w="1361"/>
-          </w:tcPr>
-          <w:p>
-            <w:pPr>
-              <w:jc w:val="center"/>
-            </w:pPr>
-            <w:r/>
-            <w:r>
-              <w:rPr>
-                <w:rFonts w:ascii="Times New Roman" w:hAnsi="Times New Roman" w:eastAsia="宋体"/>
-                <w:sz w:val="18"/>
-              </w:rPr>
-              <w:t>5290e4e</w:t>
-            </w:r>
-          </w:p>
-        </w:tc>
-        <w:tc>
-          <w:tcPr>
-            <w:tcW w:type="dxa" w:w="7030"/>
-          </w:tcPr>
-          <w:p>
-            <w:pPr>
-              <w:jc w:val="left"/>
-            </w:pPr>
-            <w:r/>
-            <w:r>
-              <w:rPr>
-                <w:rFonts w:ascii="Times New Roman" w:hAnsi="Times New Roman" w:eastAsia="宋体"/>
-                <w:sz w:val="18"/>
-              </w:rPr>
-              <w:t>添加课程要求 PDF（C++ 实验大纲 2026）</w:t>
-            </w:r>
-          </w:p>
-        </w:tc>
-      </w:tr>
-      <w:tr>
-        <w:tc>
-          <w:tcPr>
-            <w:tcW w:type="dxa" w:w="567"/>
-          </w:tcPr>
-          <w:p>
-            <w:pPr>
-              <w:jc w:val="center"/>
-            </w:pPr>
-            <w:r/>
-            <w:r>
-              <w:rPr>
-                <w:rFonts w:ascii="Times New Roman" w:hAnsi="Times New Roman" w:eastAsia="宋体"/>
-                <w:sz w:val="18"/>
-              </w:rPr>
-              <w:t>13</w:t>
-            </w:r>
-          </w:p>
-        </w:tc>
-        <w:tc>
-          <w:tcPr>
-            <w:tcW w:type="dxa" w:w="1361"/>
-          </w:tcPr>
-          <w:p>
-            <w:pPr>
-              <w:jc w:val="center"/>
-            </w:pPr>
-            <w:r/>
-            <w:r>
-              <w:rPr>
-                <w:rFonts w:ascii="Times New Roman" w:hAnsi="Times New Roman" w:eastAsia="宋体"/>
-                <w:sz w:val="18"/>
-              </w:rPr>
-              <w:t>76e2f0d</w:t>
-            </w:r>
-          </w:p>
-        </w:tc>
-        <w:tc>
-          <w:tcPr>
-            <w:tcW w:type="dxa" w:w="7030"/>
-          </w:tcPr>
-          <w:p>
-            <w:pPr>
-              <w:jc w:val="center"/>
-            </w:pPr>
-            <w:r/>
-            <w:r>
-              <w:rPr>
-                <w:rFonts w:ascii="Times New Roman" w:hAnsi="Times New Roman" w:eastAsia="宋体"/>
-                <w:sz w:val="18"/>
-              </w:rPr>
-              <w:t>为全部源文件补充注释</w:t>
-            </w:r>
-          </w:p>
-        </w:tc>
-      </w:tr>
-      <w:tr>
-        <w:tc>
-          <w:tcPr>
-            <w:tcW w:type="dxa" w:w="567"/>
-          </w:tcPr>
-          <w:p>
-            <w:pPr>
-              <w:jc w:val="center"/>
-            </w:pPr>
-            <w:r/>
-            <w:r>
-              <w:rPr>
-                <w:rFonts w:ascii="Times New Roman" w:hAnsi="Times New Roman" w:eastAsia="宋体"/>
-                <w:sz w:val="18"/>
-              </w:rPr>
-              <w:t>12</w:t>
-            </w:r>
-          </w:p>
-        </w:tc>
-        <w:tc>
-          <w:tcPr>
-            <w:tcW w:type="dxa" w:w="1361"/>
-          </w:tcPr>
-          <w:p>
-            <w:pPr>
-              <w:jc w:val="center"/>
-            </w:pPr>
-            <w:r/>
-            <w:r>
-              <w:rPr>
-                <w:rFonts w:ascii="Times New Roman" w:hAnsi="Times New Roman" w:eastAsia="宋体"/>
-                <w:sz w:val="18"/>
-              </w:rPr>
-              <w:t>1aa832a</w:t>
-            </w:r>
-          </w:p>
-        </w:tc>
-        <w:tc>
-          <w:tcPr>
-            <w:tcW w:type="dxa" w:w="7030"/>
-          </w:tcPr>
-          <w:p>
-            <w:pPr>
-              <w:jc w:val="left"/>
-            </w:pPr>
-            <w:r/>
-            <w:r>
-              <w:rPr>
-                <w:rFonts w:ascii="Times New Roman" w:hAnsi="Times New Roman" w:eastAsia="宋体"/>
-                <w:sz w:val="18"/>
-              </w:rPr>
-              <w:t>修复 Mermaid 图（GitHub 渲染器兼容）</w:t>
-            </w:r>
-          </w:p>
-        </w:tc>
-      </w:tr>
-      <w:tr>
-        <w:tc>
-          <w:tcPr>
-            <w:tcW w:type="dxa" w:w="567"/>
-          </w:tcPr>
-          <w:p>
-            <w:pPr>
-              <w:jc w:val="center"/>
-            </w:pPr>
-            <w:r/>
-            <w:r>
-              <w:rPr>
-                <w:rFonts w:ascii="Times New Roman" w:hAnsi="Times New Roman" w:eastAsia="宋体"/>
-                <w:sz w:val="18"/>
-              </w:rPr>
-              <w:t>11</w:t>
-            </w:r>
-          </w:p>
-        </w:tc>
-        <w:tc>
-          <w:tcPr>
-            <w:tcW w:type="dxa" w:w="1361"/>
-          </w:tcPr>
-          <w:p>
-            <w:pPr>
-              <w:jc w:val="center"/>
-            </w:pPr>
-            <w:r/>
-            <w:r>
-              <w:rPr>
-                <w:rFonts w:ascii="Times New Roman" w:hAnsi="Times New Roman" w:eastAsia="宋体"/>
-                <w:sz w:val="18"/>
-              </w:rPr>
-              <w:t>0b1e79b</w:t>
-            </w:r>
-          </w:p>
-        </w:tc>
-        <w:tc>
-          <w:tcPr>
-            <w:tcW w:type="dxa" w:w="7030"/>
-          </w:tcPr>
-          <w:p>
-            <w:pPr>
-              <w:jc w:val="left"/>
-            </w:pPr>
-            <w:r/>
-            <w:r>
-              <w:rPr>
-                <w:rFonts w:ascii="Times New Roman" w:hAnsi="Times New Roman" w:eastAsia="宋体"/>
-                <w:sz w:val="18"/>
-              </w:rPr>
-              <w:t>扩充 UML 类图（Map/Room 层、实体细节）</w:t>
-            </w:r>
-          </w:p>
-        </w:tc>
-      </w:tr>
-      <w:tr>
-        <w:tc>
-          <w:tcPr>
-            <w:tcW w:type="dxa" w:w="567"/>
-          </w:tcPr>
-          <w:p>
-            <w:pPr>
-              <w:jc w:val="center"/>
-            </w:pPr>
-            <w:r/>
-            <w:r>
-              <w:rPr>
-                <w:rFonts w:ascii="Times New Roman" w:hAnsi="Times New Roman" w:eastAsia="宋体"/>
-                <w:sz w:val="18"/>
-              </w:rPr>
-              <w:t>10</w:t>
-            </w:r>
-          </w:p>
-        </w:tc>
-        <w:tc>
-          <w:tcPr>
-            <w:tcW w:type="dxa" w:w="1361"/>
-          </w:tcPr>
-          <w:p>
-            <w:pPr>
-              <w:jc w:val="center"/>
-            </w:pPr>
-            <w:r/>
-            <w:r>
-              <w:rPr>
-                <w:rFonts w:ascii="Times New Roman" w:hAnsi="Times New Roman" w:eastAsia="宋体"/>
-                <w:sz w:val="18"/>
-              </w:rPr>
-              <w:t>4745605</w:t>
-            </w:r>
-          </w:p>
-        </w:tc>
-        <w:tc>
-          <w:tcPr>
-            <w:tcW w:type="dxa" w:w="7030"/>
-          </w:tcPr>
-          <w:p>
-            <w:pPr>
-              <w:jc w:val="left"/>
-            </w:pPr>
-            <w:r/>
-            <w:r>
-              <w:rPr>
-                <w:rFonts w:ascii="Times New Roman" w:hAnsi="Times New Roman" w:eastAsia="宋体"/>
-                <w:sz w:val="18"/>
-              </w:rPr>
-              <w:t>v2.31：旧版 MinGW 兼容</w:t>
-            </w:r>
-          </w:p>
-        </w:tc>
-      </w:tr>
-      <w:tr>
-        <w:tc>
-          <w:tcPr>
-            <w:tcW w:type="dxa" w:w="567"/>
-          </w:tcPr>
-          <w:p>
-            <w:pPr>
-              <w:jc w:val="center"/>
-            </w:pPr>
-            <w:r/>
-            <w:r>
-              <w:rPr>
-                <w:rFonts w:ascii="Times New Roman" w:hAnsi="Times New Roman" w:eastAsia="宋体"/>
-                <w:sz w:val="18"/>
-              </w:rPr>
-              <w:t>9</w:t>
-            </w:r>
-          </w:p>
-        </w:tc>
-        <w:tc>
-          <w:tcPr>
-            <w:tcW w:type="dxa" w:w="1361"/>
-          </w:tcPr>
-          <w:p>
-            <w:pPr>
-              <w:jc w:val="center"/>
-            </w:pPr>
-            <w:r/>
-            <w:r>
-              <w:rPr>
-                <w:rFonts w:ascii="Times New Roman" w:hAnsi="Times New Roman" w:eastAsia="宋体"/>
-                <w:sz w:val="18"/>
-              </w:rPr>
-              <w:t>2dbea79</w:t>
-            </w:r>
-          </w:p>
-        </w:tc>
-        <w:tc>
-          <w:tcPr>
-            <w:tcW w:type="dxa" w:w="7030"/>
-          </w:tcPr>
-          <w:p>
-            <w:pPr>
-              <w:jc w:val="left"/>
-            </w:pPr>
-            <w:r/>
-            <w:r>
-              <w:rPr>
-                <w:rFonts w:ascii="Times New Roman" w:hAnsi="Times New Roman" w:eastAsia="宋体"/>
-                <w:sz w:val="18"/>
-              </w:rPr>
-              <w:t>v2.3：装备显示与数值拆分（基础值+加成）</w:t>
-            </w:r>
-          </w:p>
-        </w:tc>
-      </w:tr>
-      <w:tr>
-        <w:tc>
-          <w:tcPr>
-            <w:tcW w:type="dxa" w:w="567"/>
-          </w:tcPr>
-          <w:p>
-            <w:pPr>
-              <w:jc w:val="center"/>
-            </w:pPr>
-            <w:r/>
-            <w:r>
-              <w:rPr>
-                <w:rFonts w:ascii="Times New Roman" w:hAnsi="Times New Roman" w:eastAsia="宋体"/>
-                <w:sz w:val="18"/>
-              </w:rPr>
-              <w:t>8</w:t>
-            </w:r>
-          </w:p>
-        </w:tc>
-        <w:tc>
-          <w:tcPr>
-            <w:tcW w:type="dxa" w:w="1361"/>
-          </w:tcPr>
-          <w:p>
-            <w:pPr>
-              <w:jc w:val="center"/>
-            </w:pPr>
-            <w:r/>
-            <w:r>
-              <w:rPr>
-                <w:rFonts w:ascii="Times New Roman" w:hAnsi="Times New Roman" w:eastAsia="宋体"/>
-                <w:sz w:val="18"/>
-              </w:rPr>
-              <w:t>8fc0b04</w:t>
-            </w:r>
-          </w:p>
-        </w:tc>
-        <w:tc>
-          <w:tcPr>
-            <w:tcW w:type="dxa" w:w="7030"/>
-          </w:tcPr>
-          <w:p>
-            <w:pPr>
-              <w:jc w:val="left"/>
-            </w:pPr>
-            <w:r/>
-            <w:r>
-              <w:rPr>
-                <w:rFonts w:ascii="Times New Roman" w:hAnsi="Times New Roman" w:eastAsia="宋体"/>
-                <w:sz w:val="18"/>
-              </w:rPr>
-              <w:t>说明开发历史（二维地图版因掉帧放弃）</w:t>
-            </w:r>
-          </w:p>
-        </w:tc>
-      </w:tr>
-      <w:tr>
-        <w:tc>
-          <w:tcPr>
-            <w:tcW w:type="dxa" w:w="567"/>
-          </w:tcPr>
-          <w:p>
-            <w:pPr>
-              <w:jc w:val="center"/>
-            </w:pPr>
-            <w:r/>
-            <w:r>
-              <w:rPr>
-                <w:rFonts w:ascii="Times New Roman" w:hAnsi="Times New Roman" w:eastAsia="宋体"/>
-                <w:sz w:val="18"/>
-              </w:rPr>
-              <w:t>7</w:t>
-            </w:r>
-          </w:p>
-        </w:tc>
-        <w:tc>
-          <w:tcPr>
-            <w:tcW w:type="dxa" w:w="1361"/>
-          </w:tcPr>
-          <w:p>
-            <w:pPr>
-              <w:jc w:val="center"/>
-            </w:pPr>
-            <w:r/>
-            <w:r>
-              <w:rPr>
-                <w:rFonts w:ascii="Times New Roman" w:hAnsi="Times New Roman" w:eastAsia="宋体"/>
-                <w:sz w:val="18"/>
-              </w:rPr>
-              <w:t>d0e830c</w:t>
-            </w:r>
-          </w:p>
-        </w:tc>
-        <w:tc>
-          <w:tcPr>
-            <w:tcW w:type="dxa" w:w="7030"/>
-          </w:tcPr>
-          <w:p>
-            <w:pPr>
-              <w:jc w:val="center"/>
-            </w:pPr>
-            <w:r/>
-            <w:r>
-              <w:rPr>
-                <w:rFonts w:ascii="Times New Roman" w:hAnsi="Times New Roman" w:eastAsia="宋体"/>
-                <w:sz w:val="18"/>
-              </w:rPr>
-              <w:t>技术文档同步到 v2.2</w:t>
-            </w:r>
-          </w:p>
-        </w:tc>
-      </w:tr>
-      <w:tr>
-        <w:tc>
-          <w:tcPr>
-            <w:tcW w:type="dxa" w:w="567"/>
-          </w:tcPr>
-          <w:p>
-            <w:pPr>
-              <w:jc w:val="center"/>
-            </w:pPr>
-            <w:r/>
-            <w:r>
-              <w:rPr>
-                <w:rFonts w:ascii="Times New Roman" w:hAnsi="Times New Roman" w:eastAsia="宋体"/>
-                <w:sz w:val="18"/>
-              </w:rPr>
-              <w:t>6</w:t>
-            </w:r>
-          </w:p>
-        </w:tc>
-        <w:tc>
-          <w:tcPr>
-            <w:tcW w:type="dxa" w:w="1361"/>
-          </w:tcPr>
-          <w:p>
-            <w:pPr>
-              <w:jc w:val="center"/>
-            </w:pPr>
-            <w:r/>
-            <w:r>
-              <w:rPr>
-                <w:rFonts w:ascii="Times New Roman" w:hAnsi="Times New Roman" w:eastAsia="宋体"/>
-                <w:sz w:val="18"/>
-              </w:rPr>
-              <w:t>7930976</w:t>
-            </w:r>
-          </w:p>
-        </w:tc>
-        <w:tc>
-          <w:tcPr>
-            <w:tcW w:type="dxa" w:w="7030"/>
-          </w:tcPr>
-          <w:p>
-            <w:pPr>
-              <w:jc w:val="left"/>
-            </w:pPr>
-            <w:r/>
-            <w:r>
-              <w:rPr>
-                <w:rFonts w:ascii="Times New Roman" w:hAnsi="Times New Roman" w:eastAsia="宋体"/>
-                <w:sz w:val="18"/>
-              </w:rPr>
-              <w:t>v2.2：数值平衡（魔王削弱、升级曲线加快）</w:t>
-            </w:r>
-          </w:p>
-        </w:tc>
-      </w:tr>
-      <w:tr>
-        <w:tc>
-          <w:tcPr>
-            <w:tcW w:type="dxa" w:w="567"/>
-          </w:tcPr>
-          <w:p>
-            <w:pPr>
-              <w:jc w:val="center"/>
-            </w:pPr>
-            <w:r/>
-            <w:r>
-              <w:rPr>
-                <w:rFonts w:ascii="Times New Roman" w:hAnsi="Times New Roman" w:eastAsia="宋体"/>
-                <w:sz w:val="18"/>
-              </w:rPr>
-              <w:t>5</w:t>
-            </w:r>
-          </w:p>
-        </w:tc>
-        <w:tc>
-          <w:tcPr>
-            <w:tcW w:type="dxa" w:w="1361"/>
-          </w:tcPr>
-          <w:p>
-            <w:pPr>
-              <w:jc w:val="center"/>
-            </w:pPr>
-            <w:r/>
-            <w:r>
-              <w:rPr>
-                <w:rFonts w:ascii="Times New Roman" w:hAnsi="Times New Roman" w:eastAsia="宋体"/>
-                <w:sz w:val="18"/>
-              </w:rPr>
-              <w:t>daf8bc8</w:t>
-            </w:r>
-          </w:p>
-        </w:tc>
-        <w:tc>
-          <w:tcPr>
-            <w:tcW w:type="dxa" w:w="7030"/>
-          </w:tcPr>
-          <w:p>
-            <w:pPr>
-              <w:jc w:val="left"/>
-            </w:pPr>
-            <w:r/>
-            <w:r>
-              <w:rPr>
-                <w:rFonts w:ascii="Times New Roman" w:hAnsi="Times New Roman" w:eastAsia="宋体"/>
-                <w:sz w:val="18"/>
-              </w:rPr>
-              <w:t>v2.1：消耗品修复（满血不消耗、用后消失）</w:t>
-            </w:r>
-          </w:p>
-        </w:tc>
-      </w:tr>
-      <w:tr>
-        <w:tc>
-          <w:tcPr>
-            <w:tcW w:type="dxa" w:w="567"/>
-          </w:tcPr>
-          <w:p>
-            <w:pPr>
-              <w:jc w:val="center"/>
-            </w:pPr>
-            <w:r/>
-            <w:r>
-              <w:rPr>
-                <w:rFonts w:ascii="Times New Roman" w:hAnsi="Times New Roman" w:eastAsia="宋体"/>
-                <w:sz w:val="18"/>
-              </w:rPr>
-              <w:t>4</w:t>
-            </w:r>
-          </w:p>
-        </w:tc>
-        <w:tc>
-          <w:tcPr>
-            <w:tcW w:type="dxa" w:w="1361"/>
-          </w:tcPr>
-          <w:p>
-            <w:pPr>
-              <w:jc w:val="center"/>
-            </w:pPr>
-            <w:r/>
-            <w:r>
-              <w:rPr>
-                <w:rFonts w:ascii="Times New Roman" w:hAnsi="Times New Roman" w:eastAsia="宋体"/>
-                <w:sz w:val="18"/>
-              </w:rPr>
-              <w:t>70b7a2c</w:t>
-            </w:r>
-          </w:p>
-        </w:tc>
-        <w:tc>
-          <w:tcPr>
-            <w:tcW w:type="dxa" w:w="7030"/>
-          </w:tcPr>
-          <w:p>
-            <w:pPr>
-              <w:jc w:val="left"/>
-            </w:pPr>
-            <w:r/>
-            <w:r>
-              <w:rPr>
-                <w:rFonts w:ascii="Times New Roman" w:hAnsi="Times New Roman" w:eastAsia="宋体"/>
-                <w:sz w:val="18"/>
-              </w:rPr>
-              <w:t>v2.0：存档/读档、战斗血量显示、全局咒骂</w:t>
-            </w:r>
-          </w:p>
-        </w:tc>
-      </w:tr>
-      <w:tr>
-        <w:tc>
-          <w:tcPr>
-            <w:tcW w:type="dxa" w:w="567"/>
-          </w:tcPr>
-          <w:p>
-            <w:pPr>
-              <w:jc w:val="center"/>
-            </w:pPr>
-            <w:r/>
-            <w:r>
-              <w:rPr>
-                <w:rFonts w:ascii="Times New Roman" w:hAnsi="Times New Roman" w:eastAsia="宋体"/>
-                <w:sz w:val="18"/>
-              </w:rPr>
-              <w:t>3</w:t>
-            </w:r>
-          </w:p>
-        </w:tc>
-        <w:tc>
-          <w:tcPr>
-            <w:tcW w:type="dxa" w:w="1361"/>
-          </w:tcPr>
-          <w:p>
-            <w:pPr>
-              <w:jc w:val="center"/>
-            </w:pPr>
-            <w:r/>
-            <w:r>
-              <w:rPr>
-                <w:rFonts w:ascii="Times New Roman" w:hAnsi="Times New Roman" w:eastAsia="宋体"/>
-                <w:sz w:val="18"/>
-              </w:rPr>
-              <w:t>0eee654</w:t>
-            </w:r>
-          </w:p>
-        </w:tc>
-        <w:tc>
-          <w:tcPr>
-            <w:tcW w:type="dxa" w:w="7030"/>
-          </w:tcPr>
-          <w:p>
-            <w:pPr>
-              <w:jc w:val="left"/>
-            </w:pPr>
-            <w:r/>
-            <w:r>
-              <w:rPr>
-                <w:rFonts w:ascii="Times New Roman" w:hAnsi="Times New Roman" w:eastAsia="宋体"/>
-                <w:sz w:val="18"/>
-              </w:rPr>
-              <w:t>技术文档改写为第三人称客观风格</w:t>
-            </w:r>
-          </w:p>
-        </w:tc>
-      </w:tr>
-      <w:tr>
-        <w:tc>
-          <w:tcPr>
-            <w:tcW w:type="dxa" w:w="567"/>
-          </w:tcPr>
-          <w:p>
-            <w:pPr>
-              <w:jc w:val="center"/>
-            </w:pPr>
-            <w:r/>
-            <w:r>
-              <w:rPr>
-                <w:rFonts w:ascii="Times New Roman" w:hAnsi="Times New Roman" w:eastAsia="宋体"/>
-                <w:sz w:val="18"/>
-              </w:rPr>
-              <w:t>2</w:t>
-            </w:r>
-          </w:p>
-        </w:tc>
-        <w:tc>
-          <w:tcPr>
-            <w:tcW w:type="dxa" w:w="1361"/>
-          </w:tcPr>
-          <w:p>
-            <w:pPr>
-              <w:jc w:val="center"/>
-            </w:pPr>
-            <w:r/>
-            <w:r>
-              <w:rPr>
-                <w:rFonts w:ascii="Times New Roman" w:hAnsi="Times New Roman" w:eastAsia="宋体"/>
-                <w:sz w:val="18"/>
-              </w:rPr>
-              <w:t>5ded6a7</w:t>
-            </w:r>
-          </w:p>
-        </w:tc>
-        <w:tc>
-          <w:tcPr>
-            <w:tcW w:type="dxa" w:w="7030"/>
-          </w:tcPr>
-          <w:p>
-            <w:pPr>
-              <w:jc w:val="left"/>
-            </w:pPr>
-            <w:r/>
-            <w:r>
-              <w:rPr>
-                <w:rFonts w:ascii="Times New Roman" w:hAnsi="Times New Roman" w:eastAsia="宋体"/>
-                <w:sz w:val="18"/>
-              </w:rPr>
-              <w:t>添加 C++ 实验：文字版地牢 MUD + 技术文档</w:t>
-            </w:r>
-          </w:p>
-        </w:tc>
-      </w:tr>
-      <w:tr>
-        <w:tc>
-          <w:tcPr>
-            <w:tcW w:type="dxa" w:w="567"/>
-          </w:tcPr>
-          <w:p>
-            <w:pPr>
-              <w:jc w:val="center"/>
-            </w:pPr>
-            <w:r/>
-            <w:r>
-              <w:rPr>
-                <w:rFonts w:ascii="Times New Roman" w:hAnsi="Times New Roman" w:eastAsia="宋体"/>
-                <w:sz w:val="18"/>
-              </w:rPr>
-              <w:t>1</w:t>
-            </w:r>
-          </w:p>
-        </w:tc>
-        <w:tc>
-          <w:tcPr>
-            <w:tcW w:type="dxa" w:w="1361"/>
-          </w:tcPr>
-          <w:p>
-            <w:pPr>
-              <w:jc w:val="center"/>
-            </w:pPr>
-            <w:r/>
-            <w:r>
-              <w:rPr>
-                <w:rFonts w:ascii="Times New Roman" w:hAnsi="Times New Roman" w:eastAsia="宋体"/>
-                <w:sz w:val="18"/>
-              </w:rPr>
-              <w:t>b6b06d7</w:t>
-            </w:r>
-          </w:p>
-        </w:tc>
-        <w:tc>
-          <w:tcPr>
-            <w:tcW w:type="dxa" w:w="7030"/>
-          </w:tcPr>
-          <w:p>
-            <w:pPr>
-              <w:jc w:val="left"/>
-            </w:pPr>
-            <w:r/>
-            <w:r>
-              <w:rPr>
-                <w:rFonts w:ascii="Times New Roman" w:hAnsi="Times New Roman" w:eastAsia="宋体"/>
-                <w:sz w:val="18"/>
-              </w:rPr>
-              <w:t>初始提交（Initial commit）</w:t>
-            </w:r>
-          </w:p>
-        </w:tc>
-      </w:tr>
-    </w:tbl>
-    <w:p>
-      <w:pPr>
-        <w:spacing w:after="40"/>
-      </w:pPr>
     </w:p>
     <w:p>
       <w:pPr>
@@ -8158,7 +7223,7 @@
           <w:color w:val="2E3238"/>
           <w:sz w:val="19"/>
         </w:rPr>
-        <w:t>版本演进主线：v1.0（基础可玩）→ v2.0（存档/咒骂）→ v2.1（消耗品修复）→ v2.2（数值平衡）→ v2.3（装备显示）→ v2.31（MinGW 兼容）→ v2.4（背包满不丢物品、丢弃命令、宝箱隐藏）。提交记录是小组协作与版本管理的佐证（对应第十章分工），点击 GitHub 提交号可查看改动详情。</w:t>
+        <w:t>完整提交记录可在仓库 Commits 页面按需查看，作为小组协作与版本管理的佐证（对应第十章分工）。版本演进主线：v1.0（基础可玩）→ v2.0（存档/咒骂）→ v2.1（消耗品修复）→ v2.2（数值平衡）→ v2.3（装备显示）→ v2.31（MinGW 兼容）→ v2.4（背包满不丢物品、丢弃命令、宝箱隐藏）。</w:t>
       </w:r>
     </w:p>
     <w:sectPr>

</xml_diff>

<commit_message>
docs: fix member name 徐睿昕 -> 涂睿昕 (report & PPT)
</commit_message>
<xml_diff>
--- a/docs/斗地组_实验报告.docx
+++ b/docs/斗地组_实验报告.docx
@@ -99,7 +99,7 @@
           <w:rFonts w:ascii="Times New Roman" w:hAnsi="Times New Roman" w:eastAsia="宋体"/>
           <w:sz w:val="28"/>
         </w:rPr>
-        <w:t>小组成员：丁翊君 · 张靖悦 · 宋若森 · 孙浩然 · 徐睿昕 · 宋佳媛</w:t>
+        <w:t>小组成员：丁翊君 · 张靖悦 · 宋若森 · 孙浩然 · 涂睿昕 · 宋佳媛</w:t>
       </w:r>
     </w:p>
     <w:p>
@@ -5496,7 +5496,7 @@
                 <w:rFonts w:ascii="Times New Roman" w:hAnsi="Times New Roman" w:eastAsia="宋体"/>
                 <w:sz w:val="20"/>
               </w:rPr>
-              <w:t>徐睿昕</w:t>
+              <w:t>涂睿昕</w:t>
             </w:r>
           </w:p>
         </w:tc>

</xml_diff>